<commit_message>
Werkdocument WP3 in de nieuwe huisstijl: vakken, puntenvak, geen kopregel, Zo werk je of zelfcontrole
De uitleg staat op de lespagina; het werkdocument bevat alleen wat de leerling invult (Jonas, 12-10-2026).
Lespagina: geen handeling naam/klas/datum meer, checklist 18 taken.

Co-Authored-By: Claude Opus 5.5 <noreply@anthropic.com>
</commit_message>
<xml_diff>
--- a/werkdocument/WP3_Delen-met-de-juiste-rechten.docx
+++ b/werkdocument/WP3_Delen-met-de-juiste-rechten.docx
@@ -2,113 +2,123 @@
 <file path=word/document.xml><?xml version="1.0" encoding="utf-8"?>
 <w:document xmlns:wpc="http://schemas.microsoft.com/office/word/2010/wordprocessingCanvas" xmlns:mo="http://schemas.microsoft.com/office/mac/office/2008/main" xmlns:mc="http://schemas.openxmlformats.org/markup-compatibility/2006" xmlns:mv="urn:schemas-microsoft-com:mac:vml" xmlns:o="urn:schemas-microsoft-com:office:office" xmlns:r="http://schemas.openxmlformats.org/officeDocument/2006/relationships" xmlns:m="http://schemas.openxmlformats.org/officeDocument/2006/math" xmlns:v="urn:schemas-microsoft-com:vml" xmlns:wp14="http://schemas.microsoft.com/office/word/2010/wordprocessingDrawing" xmlns:wp="http://schemas.openxmlformats.org/drawingml/2006/wordprocessingDrawing" xmlns:w10="urn:schemas-microsoft-com:office:word" xmlns:w="http://schemas.openxmlformats.org/wordprocessingml/2006/main" xmlns:w14="http://schemas.microsoft.com/office/word/2010/wordml" xmlns:wpg="http://schemas.microsoft.com/office/word/2010/wordprocessingGroup" xmlns:wpi="http://schemas.microsoft.com/office/word/2010/wordprocessingInk" xmlns:wne="http://schemas.microsoft.com/office/word/2006/wordml" xmlns:wps="http://schemas.microsoft.com/office/word/2010/wordprocessingShape" mc:Ignorable="w14 wp14">
   <w:body>
-    <w:p>
-      <w:pPr>
-        <w:spacing w:after="0"/>
-      </w:pPr>
-      <w:r>
-        <w:rPr>
-          <w:rFonts w:ascii="Arial" w:hAnsi="Arial" w:cs="Arial" w:eastAsia="Arial"/>
-          <w:b/>
-          <w:color w:val="2A3973"/>
-          <w:sz w:val="36"/>
-        </w:rPr>
-        <w:t>WERKDOCUMENT — DELEN MET DE JUISTE RECHTEN</w:t>
-      </w:r>
-    </w:p>
-    <w:p>
-      <w:pPr>
-        <w:spacing w:after="160"/>
-      </w:pPr>
-      <w:r>
-        <w:rPr>
-          <w:rFonts w:ascii="Arial" w:hAnsi="Arial" w:cs="Arial" w:eastAsia="Arial"/>
-          <w:b w:val="0"/>
-          <w:i w:val="0"/>
-          <w:color w:val="4D5573"/>
-          <w:sz w:val="19"/>
-        </w:rPr>
-        <w:t>Les 08 — Mijn digitale werkplek 3  ·  Toegepaste Informatica  ·  NovaDepot</w:t>
-      </w:r>
-    </w:p>
     <w:tbl>
       <w:tblPr>
-        <w:tblStyle w:val="TableGrid"/>
-        <w:tblW w:type="dxa" w:w="9639"/>
+        <w:tblW w:type="auto" w:w="0"/>
+        <w:jc w:val="center"/>
+        <w:tblLayout w:type="fixed"/>
+        <w:tblLook w:firstColumn="1" w:firstRow="1" w:lastColumn="0" w:lastRow="0" w:noHBand="0" w:noVBand="1" w:val="04A0"/>
         <w:tblBorders>
-          <w:top w:val="single" w:sz="6" w:space="0" w:color="8C8C8C"/>
-          <w:left w:val="single" w:sz="6" w:space="0" w:color="8C8C8C"/>
-          <w:bottom w:val="single" w:sz="6" w:space="0" w:color="8C8C8C"/>
-          <w:right w:val="single" w:sz="6" w:space="0" w:color="8C8C8C"/>
-          <w:insideH w:val="single" w:sz="6" w:space="0" w:color="8C8C8C"/>
-          <w:insideV w:val="single" w:sz="6" w:space="0" w:color="8C8C8C"/>
+          <w:top w:val="nil"/>
+          <w:left w:val="nil"/>
+          <w:bottom w:val="nil"/>
+          <w:right w:val="nil"/>
+          <w:insideH w:val="nil"/>
+          <w:insideV w:val="nil"/>
         </w:tblBorders>
         <w:tblLayout w:type="fixed"/>
-        <w:tblLook w:firstColumn="1" w:firstRow="1" w:lastColumn="0" w:lastRow="0" w:noHBand="0" w:noVBand="1" w:val="04A0"/>
       </w:tblPr>
       <w:tblGrid>
-        <w:gridCol w:w="3969"/>
-        <w:gridCol w:w="2552"/>
-        <w:gridCol w:w="3118"/>
+        <w:gridCol w:w="2041"/>
+        <w:gridCol w:w="6009"/>
+        <w:gridCol w:w="1587"/>
       </w:tblGrid>
       <w:tr>
+        <w:trPr>
+          <w:trHeight w:val="1134" w:hRule="atLeast"/>
+        </w:trPr>
         <w:tc>
           <w:tcPr>
-            <w:tcW w:type="dxa" w:w="3969"/>
+            <w:tcW w:type="dxa" w:w="2041"/>
+            <w:vAlign w:val="center"/>
           </w:tcPr>
           <w:p>
             <w:pPr>
-              <w:spacing w:after="0"/>
+              <w:spacing w:before="0" w:after="0"/>
             </w:pPr>
-            <w:r/>
             <w:r>
-              <w:rPr>
-                <w:rFonts w:ascii="Arial" w:hAnsi="Arial" w:cs="Arial" w:eastAsia="Arial"/>
-                <w:b/>
-                <w:i w:val="0"/>
-                <w:sz w:val="22"/>
-              </w:rPr>
-              <w:t xml:space="preserve">Naam: </w:t>
+              <w:drawing>
+                <wp:inline xmlns:a="http://schemas.openxmlformats.org/drawingml/2006/main" xmlns:pic="http://schemas.openxmlformats.org/drawingml/2006/picture">
+                  <wp:extent cx="1152000" cy="713354"/>
+                  <wp:docPr id="1" name="Picture 1"/>
+                  <wp:cNvGraphicFramePr>
+                    <a:graphicFrameLocks noChangeAspect="1"/>
+                  </wp:cNvGraphicFramePr>
+                  <a:graphic>
+                    <a:graphicData uri="http://schemas.openxmlformats.org/drawingml/2006/picture">
+                      <pic:pic>
+                        <pic:nvPicPr>
+                          <pic:cNvPr id="0" name="go-dalton-gent.png"/>
+                          <pic:cNvPicPr/>
+                        </pic:nvPicPr>
+                        <pic:blipFill>
+                          <a:blip r:embed="rId9"/>
+                          <a:stretch>
+                            <a:fillRect/>
+                          </a:stretch>
+                        </pic:blipFill>
+                        <pic:spPr>
+                          <a:xfrm>
+                            <a:off x="0" y="0"/>
+                            <a:ext cx="1152000" cy="713354"/>
+                          </a:xfrm>
+                          <a:prstGeom prst="rect"/>
+                        </pic:spPr>
+                      </pic:pic>
+                    </a:graphicData>
+                  </a:graphic>
+                </wp:inline>
+              </w:drawing>
             </w:r>
           </w:p>
         </w:tc>
         <w:tc>
           <w:tcPr>
-            <w:tcW w:type="dxa" w:w="2551"/>
+            <w:tcW w:type="dxa" w:w="6009"/>
+            <w:vAlign w:val="center"/>
           </w:tcPr>
           <w:p>
             <w:pPr>
-              <w:spacing w:after="0"/>
+              <w:spacing w:before="0" w:after="0"/>
+              <w:jc w:val="center"/>
             </w:pPr>
-            <w:r/>
             <w:r>
               <w:rPr>
-                <w:rFonts w:ascii="Arial" w:hAnsi="Arial" w:cs="Arial" w:eastAsia="Arial"/>
+                <w:rFonts w:ascii="Montserrat" w:hAnsi="Montserrat" w:eastAsia="Montserrat"/>
                 <w:b/>
                 <w:i w:val="0"/>
-                <w:sz w:val="22"/>
+                <w:color w:val="2A3973"/>
+                <w:sz w:val="34"/>
               </w:rPr>
-              <w:t xml:space="preserve">Klas: </w:t>
+              <w:t>DELEN MET DE JUISTE RECHTEN</w:t>
             </w:r>
           </w:p>
         </w:tc>
         <w:tc>
           <w:tcPr>
-            <w:tcW w:type="dxa" w:w="3118"/>
+            <w:tcW w:type="dxa" w:w="1587"/>
+            <w:vAlign w:val="center"/>
+            <w:tcBorders>
+              <w:top w:val="single" w:sz="12" w:space="0" w:color="3C51A0"/>
+              <w:left w:val="single" w:sz="12" w:space="0" w:color="3C51A0"/>
+              <w:bottom w:val="single" w:sz="12" w:space="0" w:color="3C51A0"/>
+              <w:right w:val="single" w:sz="12" w:space="0" w:color="3C51A0"/>
+            </w:tcBorders>
           </w:tcPr>
           <w:p>
             <w:pPr>
-              <w:spacing w:after="0"/>
+              <w:spacing w:before="0" w:after="0"/>
+              <w:jc w:val="right"/>
             </w:pPr>
-            <w:r/>
             <w:r>
               <w:rPr>
-                <w:rFonts w:ascii="Arial" w:hAnsi="Arial" w:cs="Arial" w:eastAsia="Arial"/>
+                <w:rFonts w:ascii="Montserrat" w:hAnsi="Montserrat" w:eastAsia="Montserrat"/>
                 <w:b/>
                 <w:i w:val="0"/>
-                <w:sz w:val="22"/>
+                <w:color w:val="3C51A0"/>
+                <w:sz w:val="36"/>
               </w:rPr>
-              <w:t xml:space="preserve">Datum: </w:t>
+              <w:t>/ 20</w:t>
             </w:r>
           </w:p>
         </w:tc>
@@ -116,120 +126,47 @@
     </w:tbl>
     <w:p>
       <w:pPr>
-        <w:keepNext/>
-        <w:spacing w:before="200" w:after="80"/>
+        <w:spacing w:before="0" w:after="0" w:line="200" w:lineRule="exact"/>
+        <w:rPr>
+          <w:sz w:val="10"/>
+        </w:rPr>
       </w:pPr>
-      <w:r>
-        <w:rPr>
-          <w:rFonts w:ascii="Arial" w:hAnsi="Arial" w:cs="Arial" w:eastAsia="Arial"/>
-          <w:b/>
-          <w:color w:val="2A3973"/>
-          <w:sz w:val="24"/>
-        </w:rPr>
-        <w:t>Zo werk je</w:t>
-      </w:r>
-    </w:p>
-    <w:p>
-      <w:pPr>
-        <w:spacing w:after="20"/>
-      </w:pPr>
-      <w:r>
-        <w:rPr>
-          <w:rFonts w:ascii="Arial" w:hAnsi="Arial" w:cs="Arial" w:eastAsia="Arial"/>
-          <w:b w:val="0"/>
-          <w:i w:val="0"/>
-          <w:sz w:val="22"/>
-        </w:rPr>
-        <w:t>1.  Op de lespagina lees je wat je moet doen, stap voor stap.</w:t>
-      </w:r>
-    </w:p>
-    <w:p>
-      <w:pPr>
-        <w:spacing w:after="20"/>
-      </w:pPr>
-      <w:r>
-        <w:rPr>
-          <w:rFonts w:ascii="Arial" w:hAnsi="Arial" w:cs="Arial" w:eastAsia="Arial"/>
-          <w:b w:val="0"/>
-          <w:i w:val="0"/>
-          <w:sz w:val="22"/>
-        </w:rPr>
-        <w:t>2.  Je test het delen met je buur, in je Leveringsplanning.</w:t>
-      </w:r>
-    </w:p>
-    <w:p>
-      <w:pPr>
-        <w:spacing w:after="20"/>
-      </w:pPr>
-      <w:r>
-        <w:rPr>
-          <w:rFonts w:ascii="Arial" w:hAnsi="Arial" w:cs="Arial" w:eastAsia="Arial"/>
-          <w:b w:val="0"/>
-          <w:i w:val="0"/>
-          <w:sz w:val="22"/>
-        </w:rPr>
-        <w:t>3.  In dit werkdocument schrijf je op wat je merkte.</w:t>
-      </w:r>
-    </w:p>
-    <w:p>
-      <w:pPr>
-        <w:spacing w:after="20"/>
-      </w:pPr>
-      <w:r>
-        <w:rPr>
-          <w:rFonts w:ascii="Arial" w:hAnsi="Arial" w:cs="Arial" w:eastAsia="Arial"/>
-          <w:b w:val="0"/>
-          <w:i w:val="0"/>
-          <w:sz w:val="22"/>
-        </w:rPr>
-        <w:t>4.  Klik op Inleveren: Classroom levert dit document en je Leveringsplanning samen in.</w:t>
-      </w:r>
     </w:p>
     <w:p>
       <w:pPr>
         <w:keepNext/>
-        <w:spacing w:before="280" w:after="80"/>
+        <w:pageBreakBefore w:val="0"/>
+        <w:spacing w:before="280" w:after="160"/>
+        <w:pBdr>
+          <w:bottom w:val="single" w:sz="6" w:space="3" w:color="A7B1DE"/>
+        </w:pBdr>
       </w:pPr>
       <w:r>
         <w:rPr>
-          <w:rFonts w:ascii="Arial" w:hAnsi="Arial" w:cs="Arial" w:eastAsia="Arial"/>
+          <w:rFonts w:ascii="Montserrat" w:hAnsi="Montserrat" w:eastAsia="Montserrat"/>
           <w:b/>
+          <w:i w:val="0"/>
           <w:color w:val="2A3973"/>
-          <w:sz w:val="26"/>
+          <w:sz w:val="28"/>
         </w:rPr>
-        <w:t>Deel 1 — Wat kan je met elke rol? (stap 2, 3 en 4)</w:t>
-      </w:r>
-    </w:p>
-    <w:p>
-      <w:pPr>
-        <w:spacing w:after="120"/>
-      </w:pPr>
-      <w:r>
-        <w:rPr>
-          <w:rFonts w:ascii="Arial" w:hAnsi="Arial" w:cs="Arial" w:eastAsia="Arial"/>
-          <w:b w:val="0"/>
-          <w:i w:val="0"/>
-          <w:color w:val="4D5573"/>
-          <w:sz w:val="19"/>
-        </w:rPr>
-        <w:t>Test het in de planning van je buur. Vul na elke test in: ja of nee. Rij 1 is een voorbeeld.</w:t>
+        <w:t>Deel 1 — Wat kan je met elke rol?</w:t>
       </w:r>
     </w:p>
     <w:tbl>
       <w:tblPr>
-        <w:tblStyle w:val="TableGrid"/>
-        <w:tblW w:type="dxa" w:w="9639"/>
+        <w:tblW w:type="auto" w:w="0"/>
         <w:jc w:val="center"/>
+        <w:tblLayout w:type="fixed"/>
+        <w:tblLook w:firstColumn="1" w:firstRow="1" w:lastColumn="0" w:lastRow="0" w:noHBand="0" w:noVBand="1" w:val="04A0"/>
         <w:tblBorders>
-          <w:top w:val="single" w:sz="6" w:space="0" w:color="8C8C8C"/>
-          <w:left w:val="single" w:sz="6" w:space="0" w:color="8C8C8C"/>
-          <w:bottom w:val="single" w:sz="6" w:space="0" w:color="8C8C8C"/>
-          <w:right w:val="single" w:sz="6" w:space="0" w:color="8C8C8C"/>
-          <w:insideH w:val="single" w:sz="6" w:space="0" w:color="8C8C8C"/>
-          <w:insideV w:val="single" w:sz="6" w:space="0" w:color="8C8C8C"/>
+          <w:top w:val="single" w:sz="6" w:space="0" w:color="A7B1DE"/>
+          <w:left w:val="single" w:sz="6" w:space="0" w:color="A7B1DE"/>
+          <w:bottom w:val="single" w:sz="6" w:space="0" w:color="A7B1DE"/>
+          <w:right w:val="single" w:sz="6" w:space="0" w:color="A7B1DE"/>
+          <w:insideH w:val="single" w:sz="6" w:space="0" w:color="D5DAEE"/>
+          <w:insideV w:val="single" w:sz="6" w:space="0" w:color="D5DAEE"/>
         </w:tblBorders>
         <w:tblLayout w:type="fixed"/>
-        <w:tblLook w:firstColumn="1" w:firstRow="1" w:lastColumn="0" w:lastRow="0" w:noHBand="0" w:noVBand="1" w:val="04A0"/>
       </w:tblPr>
       <w:tblGrid>
         <w:gridCol w:w="3402"/>
@@ -238,22 +175,25 @@
         <w:gridCol w:w="2098"/>
       </w:tblGrid>
       <w:tr>
+        <w:trPr>
+          <w:cantSplit/>
+        </w:trPr>
         <w:tc>
           <w:tcPr>
             <w:tcW w:type="dxa" w:w="3402"/>
-            <w:shd w:val="clear" w:fill="E4E8F6"/>
+            <w:shd w:val="clear" w:color="auto" w:fill="E4E8F6"/>
           </w:tcPr>
           <w:p>
             <w:pPr>
-              <w:spacing w:after="0"/>
+              <w:spacing w:before="0" w:after="0"/>
             </w:pPr>
             <w:r/>
             <w:r>
               <w:rPr>
-                <w:rFonts w:ascii="Arial" w:hAnsi="Arial" w:cs="Arial" w:eastAsia="Arial"/>
                 <w:b/>
                 <w:i w:val="0"/>
-                <w:sz w:val="21"/>
+                <w:color w:val="2A3973"/>
+                <w:sz w:val="22"/>
               </w:rPr>
               <w:t>Wat kan je?</w:t>
             </w:r>
@@ -262,19 +202,19 @@
         <w:tc>
           <w:tcPr>
             <w:tcW w:type="dxa" w:w="2041"/>
-            <w:shd w:val="clear" w:fill="E4E8F6"/>
+            <w:shd w:val="clear" w:color="auto" w:fill="E4E8F6"/>
           </w:tcPr>
           <w:p>
             <w:pPr>
-              <w:spacing w:after="0"/>
+              <w:spacing w:before="0" w:after="0"/>
             </w:pPr>
             <w:r/>
             <w:r>
               <w:rPr>
-                <w:rFonts w:ascii="Arial" w:hAnsi="Arial" w:cs="Arial" w:eastAsia="Arial"/>
                 <w:b/>
                 <w:i w:val="0"/>
-                <w:sz w:val="21"/>
+                <w:color w:val="2A3973"/>
+                <w:sz w:val="22"/>
               </w:rPr>
               <w:t>Als Kijker</w:t>
             </w:r>
@@ -283,19 +223,19 @@
         <w:tc>
           <w:tcPr>
             <w:tcW w:type="dxa" w:w="2098"/>
-            <w:shd w:val="clear" w:fill="E4E8F6"/>
+            <w:shd w:val="clear" w:color="auto" w:fill="E4E8F6"/>
           </w:tcPr>
           <w:p>
             <w:pPr>
-              <w:spacing w:after="0"/>
+              <w:spacing w:before="0" w:after="0"/>
             </w:pPr>
             <w:r/>
             <w:r>
               <w:rPr>
-                <w:rFonts w:ascii="Arial" w:hAnsi="Arial" w:cs="Arial" w:eastAsia="Arial"/>
                 <w:b/>
                 <w:i w:val="0"/>
-                <w:sz w:val="21"/>
+                <w:color w:val="2A3973"/>
+                <w:sz w:val="22"/>
               </w:rPr>
               <w:t>Als Reageerder</w:t>
             </w:r>
@@ -304,19 +244,19 @@
         <w:tc>
           <w:tcPr>
             <w:tcW w:type="dxa" w:w="2098"/>
-            <w:shd w:val="clear" w:fill="E4E8F6"/>
+            <w:shd w:val="clear" w:color="auto" w:fill="E4E8F6"/>
           </w:tcPr>
           <w:p>
             <w:pPr>
-              <w:spacing w:after="0"/>
+              <w:spacing w:before="0" w:after="0"/>
             </w:pPr>
             <w:r/>
             <w:r>
               <w:rPr>
-                <w:rFonts w:ascii="Arial" w:hAnsi="Arial" w:cs="Arial" w:eastAsia="Arial"/>
                 <w:b/>
                 <w:i w:val="0"/>
-                <w:sz w:val="21"/>
+                <w:color w:val="2A3973"/>
+                <w:sz w:val="22"/>
               </w:rPr>
               <w:t>Als Bewerker</w:t>
             </w:r>
@@ -325,23 +265,24 @@
       </w:tr>
       <w:tr>
         <w:trPr>
-          <w:trHeight w:val="510"/>
+          <w:trHeight w:val="567" w:hRule="atLeast"/>
+          <w:cantSplit/>
         </w:trPr>
         <w:tc>
           <w:tcPr>
             <w:tcW w:type="dxa" w:w="3402"/>
+            <w:vAlign w:val="center"/>
           </w:tcPr>
           <w:p>
             <w:pPr>
-              <w:spacing w:after="0"/>
+              <w:spacing w:before="0" w:after="0"/>
             </w:pPr>
             <w:r/>
             <w:r>
               <w:rPr>
-                <w:rFonts w:ascii="Arial" w:hAnsi="Arial" w:cs="Arial" w:eastAsia="Arial"/>
-                <w:b/>
+                <w:b w:val="0"/>
                 <w:i w:val="0"/>
-                <w:sz w:val="19"/>
+                <w:color w:val="5F6368"/>
               </w:rPr>
               <w:t>De planning lezen</w:t>
             </w:r>
@@ -350,18 +291,18 @@
         <w:tc>
           <w:tcPr>
             <w:tcW w:type="dxa" w:w="2041"/>
+            <w:vAlign w:val="center"/>
           </w:tcPr>
           <w:p>
             <w:pPr>
-              <w:spacing w:after="0"/>
+              <w:spacing w:before="0" w:after="0"/>
             </w:pPr>
             <w:r/>
             <w:r>
               <w:rPr>
-                <w:rFonts w:ascii="Arial" w:hAnsi="Arial" w:cs="Arial" w:eastAsia="Arial"/>
                 <w:b w:val="0"/>
                 <w:i/>
-                <w:sz w:val="19"/>
+                <w:color w:val="5F6368"/>
               </w:rPr>
               <w:t>ja</w:t>
             </w:r>
@@ -370,18 +311,18 @@
         <w:tc>
           <w:tcPr>
             <w:tcW w:type="dxa" w:w="2098"/>
+            <w:vAlign w:val="center"/>
           </w:tcPr>
           <w:p>
             <w:pPr>
-              <w:spacing w:after="0"/>
+              <w:spacing w:before="0" w:after="0"/>
             </w:pPr>
             <w:r/>
             <w:r>
               <w:rPr>
-                <w:rFonts w:ascii="Arial" w:hAnsi="Arial" w:cs="Arial" w:eastAsia="Arial"/>
                 <w:b w:val="0"/>
                 <w:i/>
-                <w:sz w:val="19"/>
+                <w:color w:val="5F6368"/>
               </w:rPr>
               <w:t>ja</w:t>
             </w:r>
@@ -390,18 +331,18 @@
         <w:tc>
           <w:tcPr>
             <w:tcW w:type="dxa" w:w="2098"/>
+            <w:vAlign w:val="center"/>
           </w:tcPr>
           <w:p>
             <w:pPr>
-              <w:spacing w:after="0"/>
+              <w:spacing w:before="0" w:after="0"/>
             </w:pPr>
             <w:r/>
             <w:r>
               <w:rPr>
-                <w:rFonts w:ascii="Arial" w:hAnsi="Arial" w:cs="Arial" w:eastAsia="Arial"/>
                 <w:b w:val="0"/>
                 <w:i/>
-                <w:sz w:val="19"/>
+                <w:color w:val="5F6368"/>
               </w:rPr>
               <w:t>ja</w:t>
             </w:r>
@@ -410,23 +351,23 @@
       </w:tr>
       <w:tr>
         <w:trPr>
-          <w:trHeight w:val="510"/>
+          <w:trHeight w:val="567" w:hRule="atLeast"/>
+          <w:cantSplit/>
         </w:trPr>
         <w:tc>
           <w:tcPr>
             <w:tcW w:type="dxa" w:w="3402"/>
+            <w:vAlign w:val="center"/>
           </w:tcPr>
           <w:p>
             <w:pPr>
-              <w:spacing w:after="0"/>
+              <w:spacing w:before="0" w:after="0"/>
             </w:pPr>
             <w:r/>
             <w:r>
               <w:rPr>
-                <w:rFonts w:ascii="Arial" w:hAnsi="Arial" w:cs="Arial" w:eastAsia="Arial"/>
-                <w:b/>
+                <w:b w:val="0"/>
                 <w:i w:val="0"/>
-                <w:sz w:val="19"/>
               </w:rPr>
               <w:t>Een reactie schrijven</w:t>
             </w:r>
@@ -435,240 +376,305 @@
         <w:tc>
           <w:tcPr>
             <w:tcW w:type="dxa" w:w="2041"/>
+            <w:vAlign w:val="center"/>
+            <w:shd w:val="clear" w:color="auto" w:fill="F3F5FC"/>
           </w:tcPr>
-          <w:p/>
+          <w:p>
+            <w:pPr>
+              <w:spacing w:before="0" w:after="0"/>
+            </w:pPr>
+          </w:p>
         </w:tc>
         <w:tc>
           <w:tcPr>
             <w:tcW w:type="dxa" w:w="2098"/>
+            <w:vAlign w:val="center"/>
+            <w:shd w:val="clear" w:color="auto" w:fill="F3F5FC"/>
           </w:tcPr>
-          <w:p/>
+          <w:p>
+            <w:pPr>
+              <w:spacing w:before="0" w:after="0"/>
+            </w:pPr>
+          </w:p>
         </w:tc>
         <w:tc>
           <w:tcPr>
             <w:tcW w:type="dxa" w:w="2098"/>
+            <w:vAlign w:val="center"/>
+            <w:shd w:val="clear" w:color="auto" w:fill="F3F5FC"/>
           </w:tcPr>
-          <w:p/>
+          <w:p>
+            <w:pPr>
+              <w:spacing w:before="0" w:after="0"/>
+            </w:pPr>
+          </w:p>
         </w:tc>
       </w:tr>
       <w:tr>
         <w:trPr>
-          <w:trHeight w:val="510"/>
+          <w:trHeight w:val="567" w:hRule="atLeast"/>
+          <w:cantSplit/>
         </w:trPr>
         <w:tc>
           <w:tcPr>
             <w:tcW w:type="dxa" w:w="3402"/>
+            <w:vAlign w:val="center"/>
           </w:tcPr>
           <w:p>
             <w:pPr>
-              <w:spacing w:after="0"/>
+              <w:spacing w:before="0" w:after="0"/>
             </w:pPr>
             <w:r/>
             <w:r>
               <w:rPr>
-                <w:rFonts w:ascii="Arial" w:hAnsi="Arial" w:cs="Arial" w:eastAsia="Arial"/>
-                <w:b/>
+                <w:b w:val="0"/>
                 <w:i w:val="0"/>
-                <w:sz w:val="19"/>
               </w:rPr>
-              <w:t>Een regel zelf veranderen</w:t>
+              <w:t>Een regel zelf veranderen (een voorstel telt niet)</w:t>
             </w:r>
           </w:p>
         </w:tc>
         <w:tc>
           <w:tcPr>
             <w:tcW w:type="dxa" w:w="2041"/>
+            <w:vAlign w:val="center"/>
+            <w:shd w:val="clear" w:color="auto" w:fill="F3F5FC"/>
           </w:tcPr>
-          <w:p/>
+          <w:p>
+            <w:pPr>
+              <w:spacing w:before="0" w:after="0"/>
+            </w:pPr>
+          </w:p>
         </w:tc>
         <w:tc>
           <w:tcPr>
             <w:tcW w:type="dxa" w:w="2098"/>
+            <w:vAlign w:val="center"/>
+            <w:shd w:val="clear" w:color="auto" w:fill="F3F5FC"/>
           </w:tcPr>
-          <w:p/>
+          <w:p>
+            <w:pPr>
+              <w:spacing w:before="0" w:after="0"/>
+            </w:pPr>
+          </w:p>
         </w:tc>
         <w:tc>
           <w:tcPr>
             <w:tcW w:type="dxa" w:w="2098"/>
+            <w:vAlign w:val="center"/>
+            <w:shd w:val="clear" w:color="auto" w:fill="F3F5FC"/>
           </w:tcPr>
-          <w:p/>
+          <w:p>
+            <w:pPr>
+              <w:spacing w:before="0" w:after="0"/>
+            </w:pPr>
+          </w:p>
         </w:tc>
       </w:tr>
     </w:tbl>
     <w:p>
       <w:pPr>
-        <w:spacing w:after="40"/>
+        <w:spacing w:before="0" w:after="0" w:line="80" w:lineRule="exact"/>
+        <w:rPr>
+          <w:sz w:val="4"/>
+        </w:rPr>
+      </w:pPr>
+    </w:p>
+    <w:p>
+      <w:pPr>
+        <w:keepNext/>
+        <w:pageBreakBefore w:val="0"/>
+        <w:spacing w:before="280" w:after="160"/>
+        <w:pBdr>
+          <w:bottom w:val="single" w:sz="6" w:space="3" w:color="A7B1DE"/>
+        </w:pBdr>
       </w:pPr>
       <w:r>
         <w:rPr>
-          <w:rFonts w:ascii="Arial" w:hAnsi="Arial" w:cs="Arial" w:eastAsia="Arial"/>
-          <w:b w:val="0"/>
+          <w:rFonts w:ascii="Montserrat" w:hAnsi="Montserrat" w:eastAsia="Montserrat"/>
+          <w:b/>
           <w:i w:val="0"/>
-          <w:color w:val="4D5573"/>
-          <w:sz w:val="19"/>
+          <w:color w:val="2A3973"/>
+          <w:sz w:val="28"/>
         </w:rPr>
-        <w:t>Zelf veranderen: de tekst verandert meteen. Een voorstel (suggestie) telt niet mee.</w:t>
+        <w:t>Deel 2 — Een regel terug</w:t>
       </w:r>
     </w:p>
     <w:p>
       <w:pPr>
         <w:keepNext/>
-        <w:spacing w:before="280" w:after="80"/>
+        <w:spacing w:before="160" w:after="80"/>
       </w:pPr>
       <w:r>
         <w:rPr>
-          <w:rFonts w:ascii="Arial" w:hAnsi="Arial" w:cs="Arial" w:eastAsia="Arial"/>
           <w:b/>
-          <w:color w:val="2A3973"/>
-          <w:sz w:val="26"/>
-        </w:rPr>
-        <w:t>Deel 2 — Een regel terug (stap 4)</w:t>
-      </w:r>
-    </w:p>
-    <w:p>
-      <w:pPr>
-        <w:spacing w:after="40"/>
-      </w:pPr>
-      <w:r>
-        <w:rPr>
-          <w:rFonts w:ascii="Arial" w:hAnsi="Arial" w:cs="Arial" w:eastAsia="Arial"/>
-          <w:b/>
-          <w:i w:val="0"/>
-          <w:sz w:val="22"/>
         </w:rPr>
         <w:t>Vraag 1. Welke regel wiste je buur in jouw planning?</w:t>
       </w:r>
     </w:p>
+    <w:tbl>
+      <w:tblPr>
+        <w:tblW w:type="auto" w:w="0"/>
+        <w:jc w:val="center"/>
+        <w:tblLayout w:type="fixed"/>
+        <w:tblLook w:firstColumn="1" w:firstRow="1" w:lastColumn="0" w:lastRow="0" w:noHBand="0" w:noVBand="1" w:val="04A0"/>
+        <w:tblBorders>
+          <w:top w:val="single" w:sz="6" w:space="0" w:color="A7B1DE"/>
+          <w:left w:val="single" w:sz="6" w:space="0" w:color="A7B1DE"/>
+          <w:bottom w:val="single" w:sz="6" w:space="0" w:color="A7B1DE"/>
+          <w:right w:val="single" w:sz="6" w:space="0" w:color="A7B1DE"/>
+          <w:insideH w:val="nil"/>
+          <w:insideV w:val="nil"/>
+        </w:tblBorders>
+        <w:tblLayout w:type="fixed"/>
+      </w:tblPr>
+      <w:tblGrid>
+        <w:gridCol w:w="9638"/>
+      </w:tblGrid>
+      <w:tr>
+        <w:trPr>
+          <w:trHeight w:val="680" w:hRule="atLeast"/>
+          <w:cantSplit/>
+        </w:trPr>
+        <w:tc>
+          <w:tcPr>
+            <w:tcW w:type="dxa" w:w="9638"/>
+            <w:shd w:val="clear" w:color="auto" w:fill="F3F5FC"/>
+          </w:tcPr>
+          <w:p>
+            <w:pPr>
+              <w:spacing w:before="0" w:after="0"/>
+            </w:pPr>
+          </w:p>
+        </w:tc>
+      </w:tr>
+    </w:tbl>
     <w:p>
       <w:pPr>
-        <w:spacing w:after="40"/>
+        <w:spacing w:before="0" w:after="0" w:line="80" w:lineRule="exact"/>
+        <w:rPr>
+          <w:sz w:val="4"/>
+        </w:rPr>
+      </w:pPr>
+    </w:p>
+    <w:p>
+      <w:pPr>
+        <w:keepNext/>
+        <w:spacing w:before="160" w:after="80"/>
       </w:pPr>
       <w:r>
         <w:rPr>
-          <w:rFonts w:ascii="Arial" w:hAnsi="Arial" w:cs="Arial" w:eastAsia="Arial"/>
-          <w:color w:val="808080"/>
-        </w:rPr>
-        <w:t>______________________________________________________________________________</w:t>
-      </w:r>
-    </w:p>
-    <w:p>
-      <w:pPr>
-        <w:spacing w:after="40"/>
-      </w:pPr>
-      <w:r>
-        <w:rPr>
-          <w:rFonts w:ascii="Arial" w:hAnsi="Arial" w:cs="Arial" w:eastAsia="Arial"/>
           <w:b/>
-          <w:i w:val="0"/>
-          <w:sz w:val="22"/>
         </w:rPr>
         <w:t>Vraag 2. Hoe kreeg je de regel terug? Schrijf het in je eigen woorden.</w:t>
       </w:r>
     </w:p>
+    <w:tbl>
+      <w:tblPr>
+        <w:tblW w:type="auto" w:w="0"/>
+        <w:jc w:val="center"/>
+        <w:tblLayout w:type="fixed"/>
+        <w:tblLook w:firstColumn="1" w:firstRow="1" w:lastColumn="0" w:lastRow="0" w:noHBand="0" w:noVBand="1" w:val="04A0"/>
+        <w:tblBorders>
+          <w:top w:val="single" w:sz="6" w:space="0" w:color="A7B1DE"/>
+          <w:left w:val="single" w:sz="6" w:space="0" w:color="A7B1DE"/>
+          <w:bottom w:val="single" w:sz="6" w:space="0" w:color="A7B1DE"/>
+          <w:right w:val="single" w:sz="6" w:space="0" w:color="A7B1DE"/>
+          <w:insideH w:val="nil"/>
+          <w:insideV w:val="nil"/>
+        </w:tblBorders>
+        <w:tblLayout w:type="fixed"/>
+      </w:tblPr>
+      <w:tblGrid>
+        <w:gridCol w:w="9638"/>
+      </w:tblGrid>
+      <w:tr>
+        <w:trPr>
+          <w:trHeight w:val="1360" w:hRule="atLeast"/>
+          <w:cantSplit/>
+        </w:trPr>
+        <w:tc>
+          <w:tcPr>
+            <w:tcW w:type="dxa" w:w="9638"/>
+            <w:shd w:val="clear" w:color="auto" w:fill="F3F5FC"/>
+          </w:tcPr>
+          <w:p>
+            <w:pPr>
+              <w:spacing w:before="0" w:after="0"/>
+            </w:pPr>
+          </w:p>
+        </w:tc>
+      </w:tr>
+    </w:tbl>
     <w:p>
       <w:pPr>
-        <w:spacing w:after="40"/>
+        <w:spacing w:before="0" w:after="0" w:line="80" w:lineRule="exact"/>
+        <w:rPr>
+          <w:sz w:val="4"/>
+        </w:rPr>
       </w:pPr>
-      <w:r>
-        <w:rPr>
-          <w:rFonts w:ascii="Arial" w:hAnsi="Arial" w:cs="Arial" w:eastAsia="Arial"/>
-          <w:color w:val="808080"/>
-        </w:rPr>
-        <w:t>______________________________________________________________________________</w:t>
-      </w:r>
-    </w:p>
-    <w:p>
-      <w:pPr>
-        <w:spacing w:after="40"/>
-      </w:pPr>
-      <w:r>
-        <w:rPr>
-          <w:rFonts w:ascii="Arial" w:hAnsi="Arial" w:cs="Arial" w:eastAsia="Arial"/>
-          <w:color w:val="808080"/>
-        </w:rPr>
-        <w:t>______________________________________________________________________________</w:t>
-      </w:r>
-    </w:p>
-    <w:p>
-      <w:pPr>
-        <w:spacing w:after="40"/>
-      </w:pPr>
-      <w:r>
-        <w:rPr>
-          <w:rFonts w:ascii="Arial" w:hAnsi="Arial" w:cs="Arial" w:eastAsia="Arial"/>
-          <w:color w:val="808080"/>
-        </w:rPr>
-        <w:t>______________________________________________________________________________</w:t>
-      </w:r>
     </w:p>
     <w:p>
       <w:pPr>
         <w:keepNext/>
-        <w:spacing w:before="280" w:after="80"/>
+        <w:pageBreakBefore w:val="0"/>
+        <w:spacing w:before="280" w:after="160"/>
+        <w:pBdr>
+          <w:bottom w:val="single" w:sz="6" w:space="3" w:color="A7B1DE"/>
+        </w:pBdr>
       </w:pPr>
       <w:r>
         <w:rPr>
-          <w:rFonts w:ascii="Arial" w:hAnsi="Arial" w:cs="Arial" w:eastAsia="Arial"/>
+          <w:rFonts w:ascii="Montserrat" w:hAnsi="Montserrat" w:eastAsia="Montserrat"/>
           <w:b/>
+          <w:i w:val="0"/>
           <w:color w:val="2A3973"/>
-          <w:sz w:val="26"/>
+          <w:sz w:val="28"/>
         </w:rPr>
-        <w:t>Deel 3 — Wie krijgt welke rol? (stap 5 en 6)</w:t>
-      </w:r>
-    </w:p>
-    <w:p>
-      <w:pPr>
-        <w:spacing w:after="120"/>
-      </w:pPr>
-      <w:r>
-        <w:rPr>
-          <w:rFonts w:ascii="Arial" w:hAnsi="Arial" w:cs="Arial" w:eastAsia="Arial"/>
-          <w:b w:val="0"/>
-          <w:i w:val="0"/>
-          <w:color w:val="4D5573"/>
-          <w:sz w:val="19"/>
-        </w:rPr>
-        <w:t>Kies Kijker, Reageerder of Bewerker. Geef zo weinig rechten als nodig. Rij 1 is een voorbeeld.</w:t>
+        <w:t>Deel 3 — Wie krijgt welke rol?</w:t>
       </w:r>
     </w:p>
     <w:tbl>
       <w:tblPr>
-        <w:tblStyle w:val="TableGrid"/>
-        <w:tblW w:type="dxa" w:w="9639"/>
+        <w:tblW w:type="auto" w:w="0"/>
         <w:jc w:val="center"/>
+        <w:tblLayout w:type="fixed"/>
+        <w:tblLook w:firstColumn="1" w:firstRow="1" w:lastColumn="0" w:lastRow="0" w:noHBand="0" w:noVBand="1" w:val="04A0"/>
         <w:tblBorders>
-          <w:top w:val="single" w:sz="6" w:space="0" w:color="8C8C8C"/>
-          <w:left w:val="single" w:sz="6" w:space="0" w:color="8C8C8C"/>
-          <w:bottom w:val="single" w:sz="6" w:space="0" w:color="8C8C8C"/>
-          <w:right w:val="single" w:sz="6" w:space="0" w:color="8C8C8C"/>
-          <w:insideH w:val="single" w:sz="6" w:space="0" w:color="8C8C8C"/>
-          <w:insideV w:val="single" w:sz="6" w:space="0" w:color="8C8C8C"/>
+          <w:top w:val="single" w:sz="6" w:space="0" w:color="A7B1DE"/>
+          <w:left w:val="single" w:sz="6" w:space="0" w:color="A7B1DE"/>
+          <w:bottom w:val="single" w:sz="6" w:space="0" w:color="A7B1DE"/>
+          <w:right w:val="single" w:sz="6" w:space="0" w:color="A7B1DE"/>
+          <w:insideH w:val="single" w:sz="6" w:space="0" w:color="D5DAEE"/>
+          <w:insideV w:val="single" w:sz="6" w:space="0" w:color="D5DAEE"/>
         </w:tblBorders>
         <w:tblLayout w:type="fixed"/>
-        <w:tblLook w:firstColumn="1" w:firstRow="1" w:lastColumn="0" w:lastRow="0" w:noHBand="0" w:noVBand="1" w:val="04A0"/>
       </w:tblPr>
       <w:tblGrid>
-        <w:gridCol w:w="2722"/>
+        <w:gridCol w:w="2721"/>
         <w:gridCol w:w="4649"/>
         <w:gridCol w:w="2268"/>
       </w:tblGrid>
       <w:tr>
+        <w:trPr>
+          <w:cantSplit/>
+        </w:trPr>
         <w:tc>
           <w:tcPr>
             <w:tcW w:type="dxa" w:w="2721"/>
-            <w:shd w:val="clear" w:fill="E4E8F6"/>
+            <w:shd w:val="clear" w:color="auto" w:fill="E4E8F6"/>
           </w:tcPr>
           <w:p>
             <w:pPr>
-              <w:spacing w:after="0"/>
+              <w:spacing w:before="0" w:after="0"/>
             </w:pPr>
             <w:r/>
             <w:r>
               <w:rPr>
-                <w:rFonts w:ascii="Arial" w:hAnsi="Arial" w:cs="Arial" w:eastAsia="Arial"/>
                 <w:b/>
                 <w:i w:val="0"/>
-                <w:sz w:val="21"/>
+                <w:color w:val="2A3973"/>
+                <w:sz w:val="22"/>
               </w:rPr>
               <w:t>Wie?</w:t>
             </w:r>
@@ -677,19 +683,19 @@
         <w:tc>
           <w:tcPr>
             <w:tcW w:type="dxa" w:w="4649"/>
-            <w:shd w:val="clear" w:fill="E4E8F6"/>
+            <w:shd w:val="clear" w:color="auto" w:fill="E4E8F6"/>
           </w:tcPr>
           <w:p>
             <w:pPr>
-              <w:spacing w:after="0"/>
+              <w:spacing w:before="0" w:after="0"/>
             </w:pPr>
             <w:r/>
             <w:r>
               <w:rPr>
-                <w:rFonts w:ascii="Arial" w:hAnsi="Arial" w:cs="Arial" w:eastAsia="Arial"/>
                 <w:b/>
                 <w:i w:val="0"/>
-                <w:sz w:val="21"/>
+                <w:color w:val="2A3973"/>
+                <w:sz w:val="22"/>
               </w:rPr>
               <w:t>Wat moet die persoon kunnen?</w:t>
             </w:r>
@@ -698,19 +704,19 @@
         <w:tc>
           <w:tcPr>
             <w:tcW w:type="dxa" w:w="2268"/>
-            <w:shd w:val="clear" w:fill="E4E8F6"/>
+            <w:shd w:val="clear" w:color="auto" w:fill="E4E8F6"/>
           </w:tcPr>
           <w:p>
             <w:pPr>
-              <w:spacing w:after="0"/>
+              <w:spacing w:before="0" w:after="0"/>
             </w:pPr>
             <w:r/>
             <w:r>
               <w:rPr>
-                <w:rFonts w:ascii="Arial" w:hAnsi="Arial" w:cs="Arial" w:eastAsia="Arial"/>
                 <w:b/>
                 <w:i w:val="0"/>
-                <w:sz w:val="21"/>
+                <w:color w:val="2A3973"/>
+                <w:sz w:val="22"/>
               </w:rPr>
               <w:t>Welke rol?</w:t>
             </w:r>
@@ -719,23 +725,24 @@
       </w:tr>
       <w:tr>
         <w:trPr>
-          <w:trHeight w:val="567"/>
+          <w:trHeight w:val="567" w:hRule="atLeast"/>
+          <w:cantSplit/>
         </w:trPr>
         <w:tc>
           <w:tcPr>
             <w:tcW w:type="dxa" w:w="2721"/>
+            <w:vAlign w:val="center"/>
           </w:tcPr>
           <w:p>
             <w:pPr>
-              <w:spacing w:after="0"/>
+              <w:spacing w:before="0" w:after="0"/>
             </w:pPr>
             <w:r/>
             <w:r>
               <w:rPr>
-                <w:rFonts w:ascii="Arial" w:hAnsi="Arial" w:cs="Arial" w:eastAsia="Arial"/>
-                <w:b/>
+                <w:b w:val="0"/>
                 <w:i w:val="0"/>
-                <w:sz w:val="19"/>
+                <w:color w:val="5F6368"/>
               </w:rPr>
               <w:t>Sara Claes (preventiedienst)</w:t>
             </w:r>
@@ -744,18 +751,18 @@
         <w:tc>
           <w:tcPr>
             <w:tcW w:type="dxa" w:w="4649"/>
+            <w:vAlign w:val="center"/>
           </w:tcPr>
           <w:p>
             <w:pPr>
-              <w:spacing w:after="0"/>
+              <w:spacing w:before="0" w:after="0"/>
             </w:pPr>
             <w:r/>
             <w:r>
               <w:rPr>
-                <w:rFonts w:ascii="Arial" w:hAnsi="Arial" w:cs="Arial" w:eastAsia="Arial"/>
                 <w:b w:val="0"/>
-                <w:i/>
-                <w:sz w:val="19"/>
+                <w:i w:val="0"/>
+                <w:color w:val="5F6368"/>
               </w:rPr>
               <w:t>de planning lezen, maar niets veranderen</w:t>
             </w:r>
@@ -764,18 +771,18 @@
         <w:tc>
           <w:tcPr>
             <w:tcW w:type="dxa" w:w="2268"/>
+            <w:vAlign w:val="center"/>
           </w:tcPr>
           <w:p>
             <w:pPr>
-              <w:spacing w:after="0"/>
+              <w:spacing w:before="0" w:after="0"/>
             </w:pPr>
             <w:r/>
             <w:r>
               <w:rPr>
-                <w:rFonts w:ascii="Arial" w:hAnsi="Arial" w:cs="Arial" w:eastAsia="Arial"/>
                 <w:b w:val="0"/>
                 <w:i/>
-                <w:sz w:val="19"/>
+                <w:color w:val="5F6368"/>
               </w:rPr>
               <w:t>Kijker</w:t>
             </w:r>
@@ -784,23 +791,23 @@
       </w:tr>
       <w:tr>
         <w:trPr>
-          <w:trHeight w:val="567"/>
+          <w:trHeight w:val="567" w:hRule="atLeast"/>
+          <w:cantSplit/>
         </w:trPr>
         <w:tc>
           <w:tcPr>
             <w:tcW w:type="dxa" w:w="2721"/>
+            <w:vAlign w:val="center"/>
           </w:tcPr>
           <w:p>
             <w:pPr>
-              <w:spacing w:after="0"/>
+              <w:spacing w:before="0" w:after="0"/>
             </w:pPr>
             <w:r/>
             <w:r>
               <w:rPr>
-                <w:rFonts w:ascii="Arial" w:hAnsi="Arial" w:cs="Arial" w:eastAsia="Arial"/>
-                <w:b/>
+                <w:b w:val="0"/>
                 <w:i w:val="0"/>
-                <w:sz w:val="19"/>
               </w:rPr>
               <w:t>Lotte Maes (personeelsdienst)</w:t>
             </w:r>
@@ -809,18 +816,17 @@
         <w:tc>
           <w:tcPr>
             <w:tcW w:type="dxa" w:w="4649"/>
+            <w:vAlign w:val="center"/>
           </w:tcPr>
           <w:p>
             <w:pPr>
-              <w:spacing w:after="0"/>
+              <w:spacing w:before="0" w:after="0"/>
             </w:pPr>
             <w:r/>
             <w:r>
               <w:rPr>
-                <w:rFonts w:ascii="Arial" w:hAnsi="Arial" w:cs="Arial" w:eastAsia="Arial"/>
                 <w:b w:val="0"/>
                 <w:i w:val="0"/>
-                <w:sz w:val="19"/>
               </w:rPr>
               <w:t>de planning lezen en een opmerking schrijven</w:t>
             </w:r>
@@ -829,29 +835,35 @@
         <w:tc>
           <w:tcPr>
             <w:tcW w:type="dxa" w:w="2268"/>
+            <w:vAlign w:val="center"/>
+            <w:shd w:val="clear" w:color="auto" w:fill="F3F5FC"/>
           </w:tcPr>
-          <w:p/>
+          <w:p>
+            <w:pPr>
+              <w:spacing w:before="0" w:after="0"/>
+            </w:pPr>
+          </w:p>
         </w:tc>
       </w:tr>
       <w:tr>
         <w:trPr>
-          <w:trHeight w:val="567"/>
+          <w:trHeight w:val="567" w:hRule="atLeast"/>
+          <w:cantSplit/>
         </w:trPr>
         <w:tc>
           <w:tcPr>
             <w:tcW w:type="dxa" w:w="2721"/>
+            <w:vAlign w:val="center"/>
           </w:tcPr>
           <w:p>
             <w:pPr>
-              <w:spacing w:after="0"/>
+              <w:spacing w:before="0" w:after="0"/>
             </w:pPr>
             <w:r/>
             <w:r>
               <w:rPr>
-                <w:rFonts w:ascii="Arial" w:hAnsi="Arial" w:cs="Arial" w:eastAsia="Arial"/>
-                <w:b/>
+                <w:b w:val="0"/>
                 <w:i w:val="0"/>
-                <w:sz w:val="19"/>
               </w:rPr>
               <w:t>Een collega in het magazijn</w:t>
             </w:r>
@@ -860,18 +872,17 @@
         <w:tc>
           <w:tcPr>
             <w:tcW w:type="dxa" w:w="4649"/>
+            <w:vAlign w:val="center"/>
           </w:tcPr>
           <w:p>
             <w:pPr>
-              <w:spacing w:after="0"/>
+              <w:spacing w:before="0" w:after="0"/>
             </w:pPr>
             <w:r/>
             <w:r>
               <w:rPr>
-                <w:rFonts w:ascii="Arial" w:hAnsi="Arial" w:cs="Arial" w:eastAsia="Arial"/>
                 <w:b w:val="0"/>
                 <w:i w:val="0"/>
-                <w:sz w:val="19"/>
               </w:rPr>
               <w:t>de planning lezen en aanpassen</w:t>
             </w:r>
@@ -880,29 +891,35 @@
         <w:tc>
           <w:tcPr>
             <w:tcW w:type="dxa" w:w="2268"/>
+            <w:vAlign w:val="center"/>
+            <w:shd w:val="clear" w:color="auto" w:fill="F3F5FC"/>
           </w:tcPr>
-          <w:p/>
+          <w:p>
+            <w:pPr>
+              <w:spacing w:before="0" w:after="0"/>
+            </w:pPr>
+          </w:p>
         </w:tc>
       </w:tr>
       <w:tr>
         <w:trPr>
-          <w:trHeight w:val="567"/>
+          <w:trHeight w:val="567" w:hRule="atLeast"/>
+          <w:cantSplit/>
         </w:trPr>
         <w:tc>
           <w:tcPr>
             <w:tcW w:type="dxa" w:w="2721"/>
+            <w:vAlign w:val="center"/>
           </w:tcPr>
           <w:p>
             <w:pPr>
-              <w:spacing w:after="0"/>
+              <w:spacing w:before="0" w:after="0"/>
             </w:pPr>
             <w:r/>
             <w:r>
               <w:rPr>
-                <w:rFonts w:ascii="Arial" w:hAnsi="Arial" w:cs="Arial" w:eastAsia="Arial"/>
-                <w:b/>
+                <w:b w:val="0"/>
                 <w:i w:val="0"/>
-                <w:sz w:val="19"/>
               </w:rPr>
               <w:t>Je leraar, voor je map NovaDepot</w:t>
             </w:r>
@@ -911,18 +928,17 @@
         <w:tc>
           <w:tcPr>
             <w:tcW w:type="dxa" w:w="4649"/>
+            <w:vAlign w:val="center"/>
           </w:tcPr>
           <w:p>
             <w:pPr>
-              <w:spacing w:after="0"/>
+              <w:spacing w:before="0" w:after="0"/>
             </w:pPr>
             <w:r/>
             <w:r>
               <w:rPr>
-                <w:rFonts w:ascii="Arial" w:hAnsi="Arial" w:cs="Arial" w:eastAsia="Arial"/>
                 <w:b w:val="0"/>
                 <w:i w:val="0"/>
-                <w:sz w:val="19"/>
               </w:rPr>
               <w:t>je map bekijken</w:t>
             </w:r>
@@ -931,232 +947,219 @@
         <w:tc>
           <w:tcPr>
             <w:tcW w:type="dxa" w:w="2268"/>
+            <w:vAlign w:val="center"/>
+            <w:shd w:val="clear" w:color="auto" w:fill="F3F5FC"/>
           </w:tcPr>
-          <w:p/>
+          <w:p>
+            <w:pPr>
+              <w:spacing w:before="0" w:after="0"/>
+            </w:pPr>
+          </w:p>
         </w:tc>
       </w:tr>
     </w:tbl>
     <w:p>
       <w:pPr>
-        <w:spacing w:after="120"/>
+        <w:spacing w:before="0" w:after="0" w:line="80" w:lineRule="exact"/>
+        <w:rPr>
+          <w:sz w:val="4"/>
+        </w:rPr>
+      </w:pPr>
+    </w:p>
+    <w:p>
+      <w:pPr>
+        <w:keepNext/>
+        <w:spacing w:before="160" w:after="80"/>
       </w:pPr>
       <w:r>
         <w:rPr>
-          <w:rFonts w:ascii="Arial" w:hAnsi="Arial" w:cs="Arial" w:eastAsia="Arial"/>
-          <w:b w:val="0"/>
-          <w:i w:val="0"/>
-          <w:sz w:val="22"/>
-        </w:rPr>
-      </w:r>
-    </w:p>
-    <w:p>
-      <w:pPr>
-        <w:spacing w:after="40"/>
-      </w:pPr>
-      <w:r>
-        <w:rPr>
-          <w:rFonts w:ascii="Arial" w:hAnsi="Arial" w:cs="Arial" w:eastAsia="Arial"/>
           <w:b/>
-          <w:i w:val="0"/>
-          <w:sz w:val="22"/>
         </w:rPr>
         <w:t>Waarom kies je bij Algemene toegang Beperkt, en niet Iedereen met de link?</w:t>
       </w:r>
     </w:p>
+    <w:tbl>
+      <w:tblPr>
+        <w:tblW w:type="auto" w:w="0"/>
+        <w:jc w:val="center"/>
+        <w:tblLayout w:type="fixed"/>
+        <w:tblLook w:firstColumn="1" w:firstRow="1" w:lastColumn="0" w:lastRow="0" w:noHBand="0" w:noVBand="1" w:val="04A0"/>
+        <w:tblBorders>
+          <w:top w:val="single" w:sz="6" w:space="0" w:color="A7B1DE"/>
+          <w:left w:val="single" w:sz="6" w:space="0" w:color="A7B1DE"/>
+          <w:bottom w:val="single" w:sz="6" w:space="0" w:color="A7B1DE"/>
+          <w:right w:val="single" w:sz="6" w:space="0" w:color="A7B1DE"/>
+          <w:insideH w:val="nil"/>
+          <w:insideV w:val="nil"/>
+        </w:tblBorders>
+        <w:tblLayout w:type="fixed"/>
+      </w:tblPr>
+      <w:tblGrid>
+        <w:gridCol w:w="9638"/>
+      </w:tblGrid>
+      <w:tr>
+        <w:trPr>
+          <w:trHeight w:val="1020" w:hRule="atLeast"/>
+          <w:cantSplit/>
+        </w:trPr>
+        <w:tc>
+          <w:tcPr>
+            <w:tcW w:type="dxa" w:w="9638"/>
+            <w:shd w:val="clear" w:color="auto" w:fill="F3F5FC"/>
+          </w:tcPr>
+          <w:p>
+            <w:pPr>
+              <w:spacing w:before="0" w:after="0"/>
+            </w:pPr>
+          </w:p>
+        </w:tc>
+      </w:tr>
+    </w:tbl>
     <w:p>
       <w:pPr>
-        <w:spacing w:after="40"/>
+        <w:spacing w:before="0" w:after="0" w:line="80" w:lineRule="exact"/>
+        <w:rPr>
+          <w:sz w:val="4"/>
+        </w:rPr>
       </w:pPr>
-      <w:r>
-        <w:rPr>
-          <w:rFonts w:ascii="Arial" w:hAnsi="Arial" w:cs="Arial" w:eastAsia="Arial"/>
-          <w:color w:val="808080"/>
-        </w:rPr>
-        <w:t>______________________________________________________________________________</w:t>
-      </w:r>
-    </w:p>
-    <w:p>
-      <w:pPr>
-        <w:spacing w:after="40"/>
-      </w:pPr>
-      <w:r>
-        <w:rPr>
-          <w:rFonts w:ascii="Arial" w:hAnsi="Arial" w:cs="Arial" w:eastAsia="Arial"/>
-          <w:color w:val="808080"/>
-        </w:rPr>
-        <w:t>______________________________________________________________________________</w:t>
-      </w:r>
     </w:p>
     <w:p>
       <w:pPr>
         <w:keepNext/>
-        <w:spacing w:before="280" w:after="80"/>
+        <w:pageBreakBefore w:val="0"/>
+        <w:spacing w:before="280" w:after="160"/>
+        <w:pBdr>
+          <w:bottom w:val="single" w:sz="6" w:space="3" w:color="A7B1DE"/>
+        </w:pBdr>
       </w:pPr>
       <w:r>
         <w:rPr>
-          <w:rFonts w:ascii="Arial" w:hAnsi="Arial" w:cs="Arial" w:eastAsia="Arial"/>
+          <w:rFonts w:ascii="Montserrat" w:hAnsi="Montserrat" w:eastAsia="Montserrat"/>
           <w:b/>
+          <w:i w:val="0"/>
           <w:color w:val="2A3973"/>
-          <w:sz w:val="26"/>
-        </w:rPr>
-        <w:t>Zelfcontrole — aankruisen vóór je inlevert</w:t>
-      </w:r>
-    </w:p>
-    <w:p>
-      <w:pPr>
-        <w:spacing w:after="20"/>
-      </w:pPr>
-      <w:r>
-        <w:rPr>
-          <w:rFonts w:ascii="Arial" w:hAnsi="Arial" w:cs="Arial" w:eastAsia="Arial"/>
-          <w:b w:val="0"/>
-          <w:i w:val="0"/>
-          <w:sz w:val="22"/>
-        </w:rPr>
-        <w:t>☐  In mijn Leveringsplanning staat de regel van 10.30 uur er weer in.</w:t>
-      </w:r>
-    </w:p>
-    <w:p>
-      <w:pPr>
-        <w:spacing w:after="20"/>
-      </w:pPr>
-      <w:r>
-        <w:rPr>
-          <w:rFonts w:ascii="Arial" w:hAnsi="Arial" w:cs="Arial" w:eastAsia="Arial"/>
-          <w:b w:val="0"/>
-          <w:i w:val="0"/>
-          <w:sz w:val="22"/>
-        </w:rPr>
-        <w:t>☐  Mijn buur heeft geen toegang meer tot mijn Leveringsplanning.</w:t>
-      </w:r>
-    </w:p>
-    <w:p>
-      <w:pPr>
-        <w:spacing w:after="20"/>
-      </w:pPr>
-      <w:r>
-        <w:rPr>
-          <w:rFonts w:ascii="Arial" w:hAnsi="Arial" w:cs="Arial" w:eastAsia="Arial"/>
-          <w:b w:val="0"/>
-          <w:i w:val="0"/>
-          <w:sz w:val="22"/>
-        </w:rPr>
-        <w:t>☐  Mijn leraar kan mijn map NovaDepot bekijken, als Kijker.</w:t>
-      </w:r>
-    </w:p>
-    <w:p>
-      <w:pPr>
-        <w:spacing w:after="20"/>
-      </w:pPr>
-      <w:r>
-        <w:rPr>
-          <w:rFonts w:ascii="Arial" w:hAnsi="Arial" w:cs="Arial" w:eastAsia="Arial"/>
-          <w:b w:val="0"/>
-          <w:i w:val="0"/>
-          <w:sz w:val="22"/>
-        </w:rPr>
-        <w:t>☐  Bij Algemene toegang staat Beperkt.</w:t>
-      </w:r>
-    </w:p>
-    <w:p>
-      <w:pPr>
-        <w:spacing w:after="20"/>
-      </w:pPr>
-      <w:r>
-        <w:rPr>
-          <w:rFonts w:ascii="Arial" w:hAnsi="Arial" w:cs="Arial" w:eastAsia="Arial"/>
-          <w:b w:val="0"/>
-          <w:i w:val="0"/>
-          <w:sz w:val="22"/>
-        </w:rPr>
-        <w:t>☐  Deel 1, 2 en 3 zijn ingevuld.</w:t>
-      </w:r>
-    </w:p>
-    <w:p>
-      <w:pPr>
-        <w:keepNext/>
-        <w:spacing w:before="280" w:after="80"/>
-      </w:pPr>
-      <w:r>
-        <w:rPr>
-          <w:rFonts w:ascii="Arial" w:hAnsi="Arial" w:cs="Arial" w:eastAsia="Arial"/>
-          <w:b/>
-          <w:color w:val="2A3973"/>
-          <w:sz w:val="26"/>
+          <w:sz w:val="28"/>
         </w:rPr>
         <w:t>Extra — niet verplicht</w:t>
       </w:r>
     </w:p>
     <w:p>
       <w:pPr>
-        <w:spacing w:after="120"/>
+        <w:keepNext/>
+        <w:spacing w:before="160" w:after="80"/>
       </w:pPr>
       <w:r>
         <w:rPr>
-          <w:rFonts w:ascii="Arial" w:hAnsi="Arial" w:cs="Arial" w:eastAsia="Arial"/>
-          <w:b w:val="0"/>
-          <w:i w:val="0"/>
-          <w:color w:val="4D5573"/>
-          <w:sz w:val="19"/>
-        </w:rPr>
-        <w:t>Alleen als je al ingeleverd hebt. Klik in de opdracht op Inleveren ongedaan maken. Lever daarna opnieuw in.</w:t>
-      </w:r>
-    </w:p>
-    <w:p>
-      <w:pPr>
-        <w:spacing w:after="40"/>
-      </w:pPr>
-      <w:r>
-        <w:rPr>
-          <w:rFonts w:ascii="Arial" w:hAnsi="Arial" w:cs="Arial" w:eastAsia="Arial"/>
           <w:b/>
-          <w:i w:val="0"/>
-          <w:sz w:val="22"/>
         </w:rPr>
         <w:t>a) Geef de herstelde versie van je planning een naam, bijvoorbeeld Planning in orde. Welke naam gaf je?</w:t>
       </w:r>
     </w:p>
+    <w:tbl>
+      <w:tblPr>
+        <w:tblW w:type="auto" w:w="0"/>
+        <w:jc w:val="center"/>
+        <w:tblLayout w:type="fixed"/>
+        <w:tblLook w:firstColumn="1" w:firstRow="1" w:lastColumn="0" w:lastRow="0" w:noHBand="0" w:noVBand="1" w:val="04A0"/>
+        <w:tblBorders>
+          <w:top w:val="single" w:sz="6" w:space="0" w:color="A7B1DE"/>
+          <w:left w:val="single" w:sz="6" w:space="0" w:color="A7B1DE"/>
+          <w:bottom w:val="single" w:sz="6" w:space="0" w:color="A7B1DE"/>
+          <w:right w:val="single" w:sz="6" w:space="0" w:color="A7B1DE"/>
+          <w:insideH w:val="nil"/>
+          <w:insideV w:val="nil"/>
+        </w:tblBorders>
+        <w:tblLayout w:type="fixed"/>
+      </w:tblPr>
+      <w:tblGrid>
+        <w:gridCol w:w="9638"/>
+      </w:tblGrid>
+      <w:tr>
+        <w:trPr>
+          <w:trHeight w:val="680" w:hRule="atLeast"/>
+          <w:cantSplit/>
+        </w:trPr>
+        <w:tc>
+          <w:tcPr>
+            <w:tcW w:type="dxa" w:w="9638"/>
+            <w:shd w:val="clear" w:color="auto" w:fill="F3F5FC"/>
+          </w:tcPr>
+          <w:p>
+            <w:pPr>
+              <w:spacing w:before="0" w:after="0"/>
+            </w:pPr>
+          </w:p>
+        </w:tc>
+      </w:tr>
+    </w:tbl>
     <w:p>
       <w:pPr>
-        <w:spacing w:after="40"/>
+        <w:spacing w:before="0" w:after="0" w:line="80" w:lineRule="exact"/>
+        <w:rPr>
+          <w:sz w:val="4"/>
+        </w:rPr>
+      </w:pPr>
+    </w:p>
+    <w:p>
+      <w:pPr>
+        <w:keepNext/>
+        <w:spacing w:before="160" w:after="80"/>
       </w:pPr>
       <w:r>
         <w:rPr>
-          <w:rFonts w:ascii="Arial" w:hAnsi="Arial" w:cs="Arial" w:eastAsia="Arial"/>
-          <w:color w:val="808080"/>
-        </w:rPr>
-        <w:t>______________________________________________________________________________</w:t>
-      </w:r>
-    </w:p>
-    <w:p>
-      <w:pPr>
-        <w:spacing w:after="40"/>
-      </w:pPr>
-      <w:r>
-        <w:rPr>
-          <w:rFonts w:ascii="Arial" w:hAnsi="Arial" w:cs="Arial" w:eastAsia="Arial"/>
           <w:b/>
-          <w:i w:val="0"/>
-          <w:sz w:val="22"/>
         </w:rPr>
         <w:t>b) Beantwoord de reactie van je buur in je planning. Wat antwoordde je?</w:t>
       </w:r>
     </w:p>
+    <w:tbl>
+      <w:tblPr>
+        <w:tblW w:type="auto" w:w="0"/>
+        <w:jc w:val="center"/>
+        <w:tblLayout w:type="fixed"/>
+        <w:tblLook w:firstColumn="1" w:firstRow="1" w:lastColumn="0" w:lastRow="0" w:noHBand="0" w:noVBand="1" w:val="04A0"/>
+        <w:tblBorders>
+          <w:top w:val="single" w:sz="6" w:space="0" w:color="A7B1DE"/>
+          <w:left w:val="single" w:sz="6" w:space="0" w:color="A7B1DE"/>
+          <w:bottom w:val="single" w:sz="6" w:space="0" w:color="A7B1DE"/>
+          <w:right w:val="single" w:sz="6" w:space="0" w:color="A7B1DE"/>
+          <w:insideH w:val="nil"/>
+          <w:insideV w:val="nil"/>
+        </w:tblBorders>
+        <w:tblLayout w:type="fixed"/>
+      </w:tblPr>
+      <w:tblGrid>
+        <w:gridCol w:w="9638"/>
+      </w:tblGrid>
+      <w:tr>
+        <w:trPr>
+          <w:trHeight w:val="680" w:hRule="atLeast"/>
+          <w:cantSplit/>
+        </w:trPr>
+        <w:tc>
+          <w:tcPr>
+            <w:tcW w:type="dxa" w:w="9638"/>
+            <w:shd w:val="clear" w:color="auto" w:fill="F3F5FC"/>
+          </w:tcPr>
+          <w:p>
+            <w:pPr>
+              <w:spacing w:before="0" w:after="0"/>
+            </w:pPr>
+          </w:p>
+        </w:tc>
+      </w:tr>
+    </w:tbl>
     <w:p>
       <w:pPr>
-        <w:spacing w:after="40"/>
+        <w:spacing w:before="0" w:after="0" w:line="80" w:lineRule="exact"/>
+        <w:rPr>
+          <w:sz w:val="4"/>
+        </w:rPr>
       </w:pPr>
-      <w:r>
-        <w:rPr>
-          <w:rFonts w:ascii="Arial" w:hAnsi="Arial" w:cs="Arial" w:eastAsia="Arial"/>
-          <w:color w:val="808080"/>
-        </w:rPr>
-        <w:t>______________________________________________________________________________</w:t>
-      </w:r>
     </w:p>
     <w:sectPr>
       <w:pgSz w:w="11906" w:h="16838"/>
-      <w:pgMar w:top="1134" w:right="1134" w:bottom="1134" w:left="1134" w:header="720" w:footer="720" w:gutter="0"/>
+      <w:pgMar w:top="1020" w:right="1134" w:bottom="1020" w:left="1134" w:header="720" w:footer="720" w:gutter="0"/>
       <w:cols w:space="720"/>
       <w:docGrid w:linePitch="360"/>
     </w:sectPr>
@@ -1528,12 +1531,12 @@
     <w:qFormat/>
     <w:rsid w:val="00FC693F"/>
     <w:pPr>
-      <w:spacing w:after="120" w:line="264" w:lineRule="auto"/>
+      <w:spacing w:after="80" w:line="264" w:lineRule="auto"/>
     </w:pPr>
     <w:rPr>
-      <w:rFonts w:ascii="Arial" w:hAnsi="Arial" w:eastAsia="Arial"/>
-      <w:sz w:val="22"/>
-      <w:lang w:val="nl-BE"/>
+      <w:rFonts w:ascii="Calibri" w:hAnsi="Calibri" w:eastAsia="Calibri"/>
+      <w:color w:val="1F1F1F"/>
+      <w:sz w:val="24"/>
     </w:rPr>
   </w:style>
   <w:style w:type="paragraph" w:styleId="Header">

</xml_diff>